<commit_message>
v3.3.0 — deber de información: afectación al derecho de información en la considerativa (R-207)
Mandato del instructor: en la considerativa, toda imputación por el
artículo 1, numeral 1, literal b) y el artículo 2 cierra el hecho con
«; involucraría una presunta afectación al derecho de información de los
consumidores. Por consiguiente, corresponde calificar ...». El resolutivo
no cambia.

- 168 plantillas maestras migradas (232 párrafos) con
  scripts/migraciones/afectacion_derecho_informacion.py (idempotente,
  solo los <w:t> del párrafo).
- sanear_admisorio.py la añade si el mapa la omite.
- R-207 en el verificador y su mutación (48 mutaciones).
- AGENTS v3.3, skills, CHANGELOG, README, versión y release v3.3.

Co-Authored-By: Claude Opus 5.5 <noreply@anthropic.com>
Claude-Session: https://claude.ai/code/session_01KqACAXVDiQbGcECnAiNcSK
</commit_message>
<xml_diff>
--- a/plantillas_maestras/01_seguro_vehicular/anulacion_indebida/2_ddos_banco_y_aseguradora/varon/TPL_2138_2025_SEGURO_VEHICULAR_ANULACION_INDEBIDA_BANCO_VARON_R1.docx
+++ b/plantillas_maestras/01_seguro_vehicular/anulacion_indebida/2_ddos_banco_y_aseguradora/varon/TPL_2138_2025_SEGURO_VEHICULAR_ANULACION_INDEBIDA_BANCO_VARON_R1.docx
@@ -2964,7 +2964,7 @@
           <w:lang w:eastAsia="es-PE"/>
           <w14:ligatures w14:val="none"/>
         </w:rPr>
-        <w:t xml:space="preserve">. Por consiguiente, corresponde calificar el hecho materia de denuncia como una presunta infracción al deber de información, tipificado en el </w:t>
+        <w:t xml:space="preserve">; involucraría una presunta afectación al derecho de información de los consumidores. Por consiguiente, corresponde calificar el hecho materia de denuncia como una presunta infracción al deber de información, tipificado en el artículo 1, numeral 1, literal b) y al artículo 2 del Código</w:t>
       </w:r>
       <w:bookmarkStart w:id="5" w:name="_Hlk195611851"/>
       <w:r>
@@ -2978,7 +2978,7 @@
           <w:lang w:eastAsia="es-PE"/>
           <w14:ligatures w14:val="none"/>
         </w:rPr>
-        <w:t xml:space="preserve">artículo 1, numeral 1, literal b) </w:t>
+        <w:t xml:space="preserve"/>
       </w:r>
       <w:bookmarkEnd w:id="5"/>
       <w:r>
@@ -2992,7 +2992,7 @@
           <w:lang w:eastAsia="es-PE"/>
           <w14:ligatures w14:val="none"/>
         </w:rPr>
-        <w:t>y al artículo 2 del Código</w:t>
+        <w:t xml:space="preserve"/>
       </w:r>
       <w:r>
         <w:rPr>

</xml_diff>